<commit_message>
fix: agencia antes de Conta Corrente nos 4 templates (split do run combinado)
</commit_message>
<xml_diff>
--- a/briefings/bradesco-fgts.docx
+++ b/briefings/bradesco-fgts.docx
@@ -8639,7 +8639,7 @@
             <w:sz w:val="24"/>
             <w:szCs w:val="24"/>
           </w:rPr>
-          <w:t>gência:                                                         Conta Corrente:</w:t>
+          <w:t xml:space="preserve">gência: </w:t>
         </w:r>
         <w:r>
           <w:rPr>
@@ -8650,6 +8650,16 @@
             <w:szCs w:val="24"/>
           </w:rPr>
           <w:t xml:space="preserve"> {agencia}</w:t>
+        </w:r>
+        <w:r>
+          <w:rPr>
+            <w:rFonts w:ascii="Times New Roman" w:hAnsi="Times New Roman" w:cs="Times New Roman"/>
+            <w:b/>
+            <w:bCs/>
+            <w:sz w:val="24"/>
+            <w:szCs w:val="24"/>
+          </w:rPr>
+          <w:t xml:space="preserve">Conta Corrente:</w:t>
         </w:r>
         <w:r>
           <w:rPr>

</xml_diff>